<commit_message>
Document details view changes
</commit_message>
<xml_diff>
--- a/frontend/src/assets/documents/privacy_PL_EN.docx
+++ b/frontend/src/assets/documents/privacy_PL_EN.docx
@@ -186,7 +186,7 @@
           <w:p>
             <w:pPr>
               <w:rPr>
-                <w:color w:val="auto"/>
+                <w:color w:val="000000" w:themeColor="text1"/>
                 <w:sz w:val="16"/>
                 <w:szCs w:val="16"/>
               </w:rPr>
@@ -195,7 +195,7 @@
               <w:rPr>
                 <w:b/>
                 <w:bCs/>
-                <w:color w:val="auto"/>
+                <w:color w:val="FFC000"/>
                 <w:sz w:val="16"/>
                 <w:szCs w:val="16"/>
               </w:rPr>
@@ -223,7 +223,7 @@
           <w:p>
             <w:pPr>
               <w:rPr>
-                <w:color w:val="auto"/>
+                <w:color w:val="000000" w:themeColor="text1"/>
                 <w:sz w:val="16"/>
                 <w:szCs w:val="16"/>
               </w:rPr>
@@ -232,7 +232,7 @@
               <w:rPr>
                 <w:b/>
                 <w:bCs/>
-                <w:color w:val="auto"/>
+                <w:color w:val="FFC000"/>
                 <w:sz w:val="16"/>
                 <w:szCs w:val="16"/>
               </w:rPr>
@@ -263,7 +263,7 @@
             <w:pPr>
               <w:spacing w:after="60"/>
               <w:rPr>
-                <w:color w:val="auto"/>
+                <w:color w:val="000000" w:themeColor="text1"/>
                 <w:sz w:val="16"/>
                 <w:szCs w:val="16"/>
               </w:rPr>
@@ -272,7 +272,7 @@
               <w:rPr>
                 <w:b/>
                 <w:bCs/>
-                <w:color w:val="auto"/>
+                <w:color w:val="000000" w:themeColor="text1"/>
                 <w:sz w:val="17"/>
                 <w:szCs w:val="17"/>
               </w:rPr>
@@ -284,14 +284,14 @@
               <w:spacing w:after="60" w:line="252" w:lineRule="auto"/>
               <w:jc w:val="both"/>
               <w:rPr>
-                <w:color w:val="auto"/>
-                <w:sz w:val="16"/>
-                <w:szCs w:val="16"/>
-              </w:rPr>
-            </w:pPr>
-            <w:r>
-              <w:rPr>
-                <w:color w:val="auto"/>
+                <w:color w:val="000000" w:themeColor="text1"/>
+                <w:sz w:val="16"/>
+                <w:szCs w:val="16"/>
+              </w:rPr>
+            </w:pPr>
+            <w:r>
+              <w:rPr>
+                <w:color w:val="000000" w:themeColor="text1"/>
                 <w:sz w:val="16"/>
                 <w:szCs w:val="16"/>
               </w:rPr>
@@ -303,14 +303,14 @@
               <w:spacing w:after="60" w:line="252" w:lineRule="auto"/>
               <w:jc w:val="both"/>
               <w:rPr>
-                <w:color w:val="auto"/>
-                <w:sz w:val="16"/>
-                <w:szCs w:val="16"/>
-              </w:rPr>
-            </w:pPr>
-            <w:r>
-              <w:rPr>
-                <w:color w:val="auto"/>
+                <w:color w:val="000000" w:themeColor="text1"/>
+                <w:sz w:val="16"/>
+                <w:szCs w:val="16"/>
+              </w:rPr>
+            </w:pPr>
+            <w:r>
+              <w:rPr>
+                <w:color w:val="000000" w:themeColor="text1"/>
                 <w:sz w:val="16"/>
                 <w:szCs w:val="16"/>
               </w:rPr>
@@ -339,7 +339,7 @@
             <w:pPr>
               <w:spacing w:after="60"/>
               <w:rPr>
-                <w:color w:val="auto"/>
+                <w:color w:val="000000" w:themeColor="text1"/>
                 <w:sz w:val="16"/>
                 <w:szCs w:val="16"/>
               </w:rPr>
@@ -348,7 +348,7 @@
               <w:rPr>
                 <w:b/>
                 <w:bCs/>
-                <w:color w:val="auto"/>
+                <w:color w:val="000000" w:themeColor="text1"/>
                 <w:sz w:val="17"/>
                 <w:szCs w:val="17"/>
               </w:rPr>
@@ -360,14 +360,14 @@
               <w:spacing w:after="60" w:line="252" w:lineRule="auto"/>
               <w:jc w:val="both"/>
               <w:rPr>
-                <w:color w:val="auto"/>
-                <w:sz w:val="16"/>
-                <w:szCs w:val="16"/>
-              </w:rPr>
-            </w:pPr>
-            <w:r>
-              <w:rPr>
-                <w:color w:val="auto"/>
+                <w:color w:val="000000" w:themeColor="text1"/>
+                <w:sz w:val="16"/>
+                <w:szCs w:val="16"/>
+              </w:rPr>
+            </w:pPr>
+            <w:r>
+              <w:rPr>
+                <w:color w:val="000000" w:themeColor="text1"/>
                 <w:sz w:val="16"/>
                 <w:szCs w:val="16"/>
               </w:rPr>
@@ -379,14 +379,14 @@
               <w:spacing w:after="60" w:line="252" w:lineRule="auto"/>
               <w:jc w:val="both"/>
               <w:rPr>
-                <w:color w:val="auto"/>
-                <w:sz w:val="16"/>
-                <w:szCs w:val="16"/>
-              </w:rPr>
-            </w:pPr>
-            <w:r>
-              <w:rPr>
-                <w:color w:val="auto"/>
+                <w:color w:val="000000" w:themeColor="text1"/>
+                <w:sz w:val="16"/>
+                <w:szCs w:val="16"/>
+              </w:rPr>
+            </w:pPr>
+            <w:r>
+              <w:rPr>
+                <w:color w:val="000000" w:themeColor="text1"/>
                 <w:sz w:val="16"/>
                 <w:szCs w:val="16"/>
               </w:rPr>
@@ -417,7 +417,7 @@
             <w:pPr>
               <w:spacing w:after="60"/>
               <w:rPr>
-                <w:color w:val="auto"/>
+                <w:color w:val="000000" w:themeColor="text1"/>
                 <w:sz w:val="16"/>
                 <w:szCs w:val="16"/>
               </w:rPr>
@@ -426,7 +426,7 @@
               <w:rPr>
                 <w:b/>
                 <w:bCs/>
-                <w:color w:val="auto"/>
+                <w:color w:val="000000" w:themeColor="text1"/>
                 <w:sz w:val="17"/>
                 <w:szCs w:val="17"/>
               </w:rPr>
@@ -438,14 +438,14 @@
               <w:spacing w:after="60" w:line="252" w:lineRule="auto"/>
               <w:jc w:val="both"/>
               <w:rPr>
-                <w:color w:val="auto"/>
-                <w:sz w:val="16"/>
-                <w:szCs w:val="16"/>
-              </w:rPr>
-            </w:pPr>
-            <w:r>
-              <w:rPr>
-                <w:color w:val="auto"/>
+                <w:color w:val="000000" w:themeColor="text1"/>
+                <w:sz w:val="16"/>
+                <w:szCs w:val="16"/>
+              </w:rPr>
+            </w:pPr>
+            <w:r>
+              <w:rPr>
+                <w:color w:val="000000" w:themeColor="text1"/>
                 <w:sz w:val="16"/>
                 <w:szCs w:val="16"/>
               </w:rPr>
@@ -474,7 +474,7 @@
             <w:pPr>
               <w:spacing w:after="60"/>
               <w:rPr>
-                <w:color w:val="auto"/>
+                <w:color w:val="000000" w:themeColor="text1"/>
                 <w:sz w:val="16"/>
                 <w:szCs w:val="16"/>
               </w:rPr>
@@ -483,7 +483,7 @@
               <w:rPr>
                 <w:b/>
                 <w:bCs/>
-                <w:color w:val="auto"/>
+                <w:color w:val="000000" w:themeColor="text1"/>
                 <w:sz w:val="17"/>
                 <w:szCs w:val="17"/>
               </w:rPr>
@@ -495,14 +495,14 @@
               <w:spacing w:after="60" w:line="252" w:lineRule="auto"/>
               <w:jc w:val="both"/>
               <w:rPr>
-                <w:color w:val="auto"/>
-                <w:sz w:val="16"/>
-                <w:szCs w:val="16"/>
-              </w:rPr>
-            </w:pPr>
-            <w:r>
-              <w:rPr>
-                <w:color w:val="auto"/>
+                <w:color w:val="000000" w:themeColor="text1"/>
+                <w:sz w:val="16"/>
+                <w:szCs w:val="16"/>
+              </w:rPr>
+            </w:pPr>
+            <w:r>
+              <w:rPr>
+                <w:color w:val="000000" w:themeColor="text1"/>
                 <w:sz w:val="16"/>
                 <w:szCs w:val="16"/>
               </w:rPr>
@@ -533,7 +533,7 @@
             <w:pPr>
               <w:spacing w:after="60"/>
               <w:rPr>
-                <w:color w:val="auto"/>
+                <w:color w:val="000000" w:themeColor="text1"/>
                 <w:sz w:val="16"/>
                 <w:szCs w:val="16"/>
               </w:rPr>
@@ -542,7 +542,7 @@
               <w:rPr>
                 <w:b/>
                 <w:bCs/>
-                <w:color w:val="auto"/>
+                <w:color w:val="000000" w:themeColor="text1"/>
                 <w:sz w:val="17"/>
                 <w:szCs w:val="17"/>
               </w:rPr>
@@ -554,14 +554,14 @@
               <w:spacing w:after="60" w:line="252" w:lineRule="auto"/>
               <w:jc w:val="both"/>
               <w:rPr>
-                <w:color w:val="auto"/>
-                <w:sz w:val="16"/>
-                <w:szCs w:val="16"/>
-              </w:rPr>
-            </w:pPr>
-            <w:r>
-              <w:rPr>
-                <w:color w:val="auto"/>
+                <w:color w:val="000000" w:themeColor="text1"/>
+                <w:sz w:val="16"/>
+                <w:szCs w:val="16"/>
+              </w:rPr>
+            </w:pPr>
+            <w:r>
+              <w:rPr>
+                <w:color w:val="000000" w:themeColor="text1"/>
                 <w:sz w:val="16"/>
                 <w:szCs w:val="16"/>
               </w:rPr>
@@ -590,7 +590,7 @@
             <w:pPr>
               <w:spacing w:after="60"/>
               <w:rPr>
-                <w:color w:val="auto"/>
+                <w:color w:val="000000" w:themeColor="text1"/>
                 <w:sz w:val="16"/>
                 <w:szCs w:val="16"/>
               </w:rPr>
@@ -599,7 +599,7 @@
               <w:rPr>
                 <w:b/>
                 <w:bCs/>
-                <w:color w:val="auto"/>
+                <w:color w:val="000000" w:themeColor="text1"/>
                 <w:sz w:val="17"/>
                 <w:szCs w:val="17"/>
               </w:rPr>
@@ -611,14 +611,14 @@
               <w:spacing w:after="60" w:line="252" w:lineRule="auto"/>
               <w:jc w:val="both"/>
               <w:rPr>
-                <w:color w:val="auto"/>
-                <w:sz w:val="16"/>
-                <w:szCs w:val="16"/>
-              </w:rPr>
-            </w:pPr>
-            <w:r>
-              <w:rPr>
-                <w:color w:val="auto"/>
+                <w:color w:val="000000" w:themeColor="text1"/>
+                <w:sz w:val="16"/>
+                <w:szCs w:val="16"/>
+              </w:rPr>
+            </w:pPr>
+            <w:r>
+              <w:rPr>
+                <w:color w:val="000000" w:themeColor="text1"/>
                 <w:sz w:val="16"/>
                 <w:szCs w:val="16"/>
               </w:rPr>
@@ -649,7 +649,7 @@
             <w:pPr>
               <w:spacing w:after="60"/>
               <w:rPr>
-                <w:color w:val="auto"/>
+                <w:color w:val="000000" w:themeColor="text1"/>
                 <w:sz w:val="16"/>
                 <w:szCs w:val="16"/>
               </w:rPr>
@@ -658,7 +658,7 @@
               <w:rPr>
                 <w:b/>
                 <w:bCs/>
-                <w:color w:val="auto"/>
+                <w:color w:val="000000" w:themeColor="text1"/>
                 <w:sz w:val="17"/>
                 <w:szCs w:val="17"/>
               </w:rPr>
@@ -674,14 +674,14 @@
               </w:numPr>
               <w:spacing w:after="40" w:line="252" w:lineRule="auto"/>
               <w:rPr>
-                <w:color w:val="auto"/>
-                <w:sz w:val="16"/>
-                <w:szCs w:val="16"/>
-              </w:rPr>
-            </w:pPr>
-            <w:r>
-              <w:rPr>
-                <w:color w:val="auto"/>
+                <w:color w:val="000000" w:themeColor="text1"/>
+                <w:sz w:val="16"/>
+                <w:szCs w:val="16"/>
+              </w:rPr>
+            </w:pPr>
+            <w:r>
+              <w:rPr>
+                <w:color w:val="000000" w:themeColor="text1"/>
                 <w:sz w:val="16"/>
                 <w:szCs w:val="16"/>
               </w:rPr>
@@ -689,7 +689,7 @@
             </w:r>
             <w:r>
               <w:rPr>
-                <w:color w:val="auto"/>
+                <w:color w:val="000000" w:themeColor="text1"/>
                 <w:sz w:val="16"/>
                 <w:szCs w:val="16"/>
               </w:rPr>
@@ -697,11 +697,29 @@
             </w:r>
             <w:r>
               <w:rPr>
-                <w:color w:val="auto"/>
-                <w:sz w:val="16"/>
-                <w:szCs w:val="16"/>
-              </w:rPr>
-              <w:t xml:space="preserve"> art. 6 ust. 1 lit. b RODO (wobec Rodzica) oraz, w zakresie danych dziecka, art. 6 ust. 1 lit. f RODO (prawnie uzasadniony interes: bezpieczna organizacja i realizacja zajęć);</w:t>
+                <w:color w:val="000000" w:themeColor="text1"/>
+                <w:sz w:val="16"/>
+                <w:szCs w:val="16"/>
+              </w:rPr>
+              <w:t xml:space="preserve"> art. 6 ust. 1 lit. b RODO (wobec Rodzica) </w:t>
+            </w:r>
+            <w:proofErr w:type="gramStart"/>
+            <w:r>
+              <w:rPr>
+                <w:color w:val="000000" w:themeColor="text1"/>
+                <w:sz w:val="16"/>
+                <w:szCs w:val="16"/>
+              </w:rPr>
+              <w:t>oraz,</w:t>
+            </w:r>
+            <w:proofErr w:type="gramEnd"/>
+            <w:r>
+              <w:rPr>
+                <w:color w:val="000000" w:themeColor="text1"/>
+                <w:sz w:val="16"/>
+                <w:szCs w:val="16"/>
+              </w:rPr>
+              <w:t xml:space="preserve"> w zakresie danych dziecka, art. 6 ust. 1 lit. f RODO (prawnie uzasadniony interes: bezpieczna organizacja i realizacja zajęć);</w:t>
             </w:r>
           </w:p>
           <w:p>
@@ -713,14 +731,14 @@
               </w:numPr>
               <w:spacing w:after="40" w:line="252" w:lineRule="auto"/>
               <w:rPr>
-                <w:color w:val="auto"/>
-                <w:sz w:val="16"/>
-                <w:szCs w:val="16"/>
-              </w:rPr>
-            </w:pPr>
-            <w:r>
-              <w:rPr>
-                <w:color w:val="auto"/>
+                <w:color w:val="000000" w:themeColor="text1"/>
+                <w:sz w:val="16"/>
+                <w:szCs w:val="16"/>
+              </w:rPr>
+            </w:pPr>
+            <w:r>
+              <w:rPr>
+                <w:color w:val="000000" w:themeColor="text1"/>
                 <w:sz w:val="16"/>
                 <w:szCs w:val="16"/>
               </w:rPr>
@@ -728,7 +746,7 @@
             </w:r>
             <w:r>
               <w:rPr>
-                <w:color w:val="auto"/>
+                <w:color w:val="000000" w:themeColor="text1"/>
                 <w:sz w:val="16"/>
                 <w:szCs w:val="16"/>
               </w:rPr>
@@ -736,7 +754,7 @@
             </w:r>
             <w:r>
               <w:rPr>
-                <w:color w:val="auto"/>
+                <w:color w:val="000000" w:themeColor="text1"/>
                 <w:sz w:val="16"/>
                 <w:szCs w:val="16"/>
               </w:rPr>
@@ -752,14 +770,14 @@
               </w:numPr>
               <w:spacing w:after="40" w:line="252" w:lineRule="auto"/>
               <w:rPr>
-                <w:color w:val="auto"/>
-                <w:sz w:val="16"/>
-                <w:szCs w:val="16"/>
-              </w:rPr>
-            </w:pPr>
-            <w:r>
-              <w:rPr>
-                <w:color w:val="auto"/>
+                <w:color w:val="000000" w:themeColor="text1"/>
+                <w:sz w:val="16"/>
+                <w:szCs w:val="16"/>
+              </w:rPr>
+            </w:pPr>
+            <w:r>
+              <w:rPr>
+                <w:color w:val="000000" w:themeColor="text1"/>
                 <w:sz w:val="16"/>
                 <w:szCs w:val="16"/>
               </w:rPr>
@@ -767,7 +785,7 @@
             </w:r>
             <w:r>
               <w:rPr>
-                <w:color w:val="auto"/>
+                <w:color w:val="000000" w:themeColor="text1"/>
                 <w:sz w:val="16"/>
                 <w:szCs w:val="16"/>
               </w:rPr>
@@ -775,7 +793,7 @@
             </w:r>
             <w:r>
               <w:rPr>
-                <w:color w:val="auto"/>
+                <w:color w:val="000000" w:themeColor="text1"/>
                 <w:sz w:val="16"/>
                 <w:szCs w:val="16"/>
               </w:rPr>
@@ -791,14 +809,14 @@
               </w:numPr>
               <w:spacing w:after="40" w:line="252" w:lineRule="auto"/>
               <w:rPr>
-                <w:color w:val="auto"/>
-                <w:sz w:val="16"/>
-                <w:szCs w:val="16"/>
-              </w:rPr>
-            </w:pPr>
-            <w:r>
-              <w:rPr>
-                <w:color w:val="auto"/>
+                <w:color w:val="000000" w:themeColor="text1"/>
+                <w:sz w:val="16"/>
+                <w:szCs w:val="16"/>
+              </w:rPr>
+            </w:pPr>
+            <w:r>
+              <w:rPr>
+                <w:color w:val="000000" w:themeColor="text1"/>
                 <w:sz w:val="16"/>
                 <w:szCs w:val="16"/>
               </w:rPr>
@@ -806,7 +824,7 @@
             </w:r>
             <w:r>
               <w:rPr>
-                <w:color w:val="auto"/>
+                <w:color w:val="000000" w:themeColor="text1"/>
                 <w:sz w:val="16"/>
                 <w:szCs w:val="16"/>
               </w:rPr>
@@ -814,7 +832,7 @@
             </w:r>
             <w:r>
               <w:rPr>
-                <w:color w:val="auto"/>
+                <w:color w:val="000000" w:themeColor="text1"/>
                 <w:sz w:val="16"/>
                 <w:szCs w:val="16"/>
               </w:rPr>
@@ -830,14 +848,14 @@
               </w:numPr>
               <w:spacing w:after="40" w:line="252" w:lineRule="auto"/>
               <w:rPr>
-                <w:color w:val="auto"/>
-                <w:sz w:val="16"/>
-                <w:szCs w:val="16"/>
-              </w:rPr>
-            </w:pPr>
-            <w:r>
-              <w:rPr>
-                <w:color w:val="auto"/>
+                <w:color w:val="000000" w:themeColor="text1"/>
+                <w:sz w:val="16"/>
+                <w:szCs w:val="16"/>
+              </w:rPr>
+            </w:pPr>
+            <w:r>
+              <w:rPr>
+                <w:color w:val="000000" w:themeColor="text1"/>
                 <w:sz w:val="16"/>
                 <w:szCs w:val="16"/>
               </w:rPr>
@@ -845,7 +863,7 @@
             </w:r>
             <w:r>
               <w:rPr>
-                <w:color w:val="auto"/>
+                <w:color w:val="000000" w:themeColor="text1"/>
                 <w:sz w:val="16"/>
                 <w:szCs w:val="16"/>
               </w:rPr>
@@ -853,7 +871,7 @@
             </w:r>
             <w:r>
               <w:rPr>
-                <w:color w:val="auto"/>
+                <w:color w:val="000000" w:themeColor="text1"/>
                 <w:sz w:val="16"/>
                 <w:szCs w:val="16"/>
               </w:rPr>
@@ -861,7 +879,7 @@
             </w:r>
             <w:r>
               <w:rPr>
-                <w:color w:val="auto"/>
+                <w:color w:val="000000" w:themeColor="text1"/>
                 <w:sz w:val="16"/>
                 <w:szCs w:val="16"/>
               </w:rPr>
@@ -869,7 +887,7 @@
             </w:r>
             <w:r>
               <w:rPr>
-                <w:color w:val="auto"/>
+                <w:color w:val="000000" w:themeColor="text1"/>
                 <w:sz w:val="16"/>
                 <w:szCs w:val="16"/>
               </w:rPr>
@@ -898,7 +916,7 @@
             <w:pPr>
               <w:spacing w:after="60"/>
               <w:rPr>
-                <w:color w:val="auto"/>
+                <w:color w:val="000000" w:themeColor="text1"/>
                 <w:sz w:val="16"/>
                 <w:szCs w:val="16"/>
               </w:rPr>
@@ -907,7 +925,7 @@
               <w:rPr>
                 <w:b/>
                 <w:bCs/>
-                <w:color w:val="auto"/>
+                <w:color w:val="000000" w:themeColor="text1"/>
                 <w:sz w:val="17"/>
                 <w:szCs w:val="17"/>
               </w:rPr>
@@ -923,14 +941,14 @@
               </w:numPr>
               <w:spacing w:after="40" w:line="252" w:lineRule="auto"/>
               <w:rPr>
-                <w:color w:val="auto"/>
-                <w:sz w:val="16"/>
-                <w:szCs w:val="16"/>
-              </w:rPr>
-            </w:pPr>
-            <w:r>
-              <w:rPr>
-                <w:color w:val="auto"/>
+                <w:color w:val="000000" w:themeColor="text1"/>
+                <w:sz w:val="16"/>
+                <w:szCs w:val="16"/>
+              </w:rPr>
+            </w:pPr>
+            <w:r>
+              <w:rPr>
+                <w:color w:val="000000" w:themeColor="text1"/>
                 <w:sz w:val="16"/>
                 <w:szCs w:val="16"/>
               </w:rPr>
@@ -938,7 +956,7 @@
             </w:r>
             <w:r>
               <w:rPr>
-                <w:color w:val="auto"/>
+                <w:color w:val="000000" w:themeColor="text1"/>
                 <w:sz w:val="16"/>
                 <w:szCs w:val="16"/>
               </w:rPr>
@@ -946,7 +964,7 @@
             </w:r>
             <w:r>
               <w:rPr>
-                <w:color w:val="auto"/>
+                <w:color w:val="000000" w:themeColor="text1"/>
                 <w:sz w:val="16"/>
                 <w:szCs w:val="16"/>
               </w:rPr>
@@ -962,14 +980,14 @@
               </w:numPr>
               <w:spacing w:after="40" w:line="252" w:lineRule="auto"/>
               <w:rPr>
-                <w:color w:val="auto"/>
-                <w:sz w:val="16"/>
-                <w:szCs w:val="16"/>
-              </w:rPr>
-            </w:pPr>
-            <w:r>
-              <w:rPr>
-                <w:color w:val="auto"/>
+                <w:color w:val="000000" w:themeColor="text1"/>
+                <w:sz w:val="16"/>
+                <w:szCs w:val="16"/>
+              </w:rPr>
+            </w:pPr>
+            <w:r>
+              <w:rPr>
+                <w:color w:val="000000" w:themeColor="text1"/>
                 <w:sz w:val="16"/>
                 <w:szCs w:val="16"/>
               </w:rPr>
@@ -977,7 +995,7 @@
             </w:r>
             <w:r>
               <w:rPr>
-                <w:color w:val="auto"/>
+                <w:color w:val="000000" w:themeColor="text1"/>
                 <w:sz w:val="16"/>
                 <w:szCs w:val="16"/>
               </w:rPr>
@@ -985,7 +1003,7 @@
             </w:r>
             <w:r>
               <w:rPr>
-                <w:color w:val="auto"/>
+                <w:color w:val="000000" w:themeColor="text1"/>
                 <w:sz w:val="16"/>
                 <w:szCs w:val="16"/>
               </w:rPr>
@@ -1001,14 +1019,14 @@
               </w:numPr>
               <w:spacing w:after="40" w:line="252" w:lineRule="auto"/>
               <w:rPr>
-                <w:color w:val="auto"/>
-                <w:sz w:val="16"/>
-                <w:szCs w:val="16"/>
-              </w:rPr>
-            </w:pPr>
-            <w:r>
-              <w:rPr>
-                <w:color w:val="auto"/>
+                <w:color w:val="000000" w:themeColor="text1"/>
+                <w:sz w:val="16"/>
+                <w:szCs w:val="16"/>
+              </w:rPr>
+            </w:pPr>
+            <w:r>
+              <w:rPr>
+                <w:color w:val="000000" w:themeColor="text1"/>
                 <w:sz w:val="16"/>
                 <w:szCs w:val="16"/>
               </w:rPr>
@@ -1016,7 +1034,7 @@
             </w:r>
             <w:r>
               <w:rPr>
-                <w:color w:val="auto"/>
+                <w:color w:val="000000" w:themeColor="text1"/>
                 <w:sz w:val="16"/>
                 <w:szCs w:val="16"/>
               </w:rPr>
@@ -1024,7 +1042,7 @@
             </w:r>
             <w:r>
               <w:rPr>
-                <w:color w:val="auto"/>
+                <w:color w:val="000000" w:themeColor="text1"/>
                 <w:sz w:val="16"/>
                 <w:szCs w:val="16"/>
               </w:rPr>
@@ -1040,14 +1058,14 @@
               </w:numPr>
               <w:spacing w:after="40" w:line="252" w:lineRule="auto"/>
               <w:rPr>
-                <w:color w:val="auto"/>
-                <w:sz w:val="16"/>
-                <w:szCs w:val="16"/>
-              </w:rPr>
-            </w:pPr>
-            <w:r>
-              <w:rPr>
-                <w:color w:val="auto"/>
+                <w:color w:val="000000" w:themeColor="text1"/>
+                <w:sz w:val="16"/>
+                <w:szCs w:val="16"/>
+              </w:rPr>
+            </w:pPr>
+            <w:r>
+              <w:rPr>
+                <w:color w:val="000000" w:themeColor="text1"/>
                 <w:sz w:val="16"/>
                 <w:szCs w:val="16"/>
               </w:rPr>
@@ -1055,7 +1073,7 @@
             </w:r>
             <w:r>
               <w:rPr>
-                <w:color w:val="auto"/>
+                <w:color w:val="000000" w:themeColor="text1"/>
                 <w:sz w:val="16"/>
                 <w:szCs w:val="16"/>
               </w:rPr>
@@ -1063,7 +1081,7 @@
             </w:r>
             <w:r>
               <w:rPr>
-                <w:color w:val="auto"/>
+                <w:color w:val="000000" w:themeColor="text1"/>
                 <w:sz w:val="16"/>
                 <w:szCs w:val="16"/>
               </w:rPr>
@@ -1079,14 +1097,14 @@
               </w:numPr>
               <w:spacing w:after="40" w:line="252" w:lineRule="auto"/>
               <w:rPr>
-                <w:color w:val="auto"/>
-                <w:sz w:val="16"/>
-                <w:szCs w:val="16"/>
-              </w:rPr>
-            </w:pPr>
-            <w:r>
-              <w:rPr>
-                <w:color w:val="auto"/>
+                <w:color w:val="000000" w:themeColor="text1"/>
+                <w:sz w:val="16"/>
+                <w:szCs w:val="16"/>
+              </w:rPr>
+            </w:pPr>
+            <w:r>
+              <w:rPr>
+                <w:color w:val="000000" w:themeColor="text1"/>
                 <w:sz w:val="16"/>
                 <w:szCs w:val="16"/>
               </w:rPr>
@@ -1094,7 +1112,7 @@
             </w:r>
             <w:r>
               <w:rPr>
-                <w:color w:val="auto"/>
+                <w:color w:val="000000" w:themeColor="text1"/>
                 <w:sz w:val="16"/>
                 <w:szCs w:val="16"/>
               </w:rPr>
@@ -1102,7 +1120,7 @@
             </w:r>
             <w:r>
               <w:rPr>
-                <w:color w:val="auto"/>
+                <w:color w:val="000000" w:themeColor="text1"/>
                 <w:sz w:val="16"/>
                 <w:szCs w:val="16"/>
               </w:rPr>
@@ -1110,7 +1128,7 @@
             </w:r>
             <w:r>
               <w:rPr>
-                <w:color w:val="auto"/>
+                <w:color w:val="000000" w:themeColor="text1"/>
                 <w:sz w:val="16"/>
                 <w:szCs w:val="16"/>
               </w:rPr>
@@ -1118,7 +1136,7 @@
             </w:r>
             <w:r>
               <w:rPr>
-                <w:color w:val="auto"/>
+                <w:color w:val="000000" w:themeColor="text1"/>
                 <w:sz w:val="16"/>
                 <w:szCs w:val="16"/>
               </w:rPr>
@@ -1149,7 +1167,7 @@
             <w:pPr>
               <w:spacing w:after="60"/>
               <w:rPr>
-                <w:color w:val="auto"/>
+                <w:color w:val="000000" w:themeColor="text1"/>
                 <w:sz w:val="16"/>
                 <w:szCs w:val="16"/>
               </w:rPr>
@@ -1158,7 +1176,7 @@
               <w:rPr>
                 <w:b/>
                 <w:bCs/>
-                <w:color w:val="auto"/>
+                <w:color w:val="000000" w:themeColor="text1"/>
                 <w:sz w:val="17"/>
                 <w:szCs w:val="17"/>
               </w:rPr>
@@ -1170,14 +1188,14 @@
               <w:spacing w:after="60" w:line="252" w:lineRule="auto"/>
               <w:jc w:val="both"/>
               <w:rPr>
-                <w:color w:val="auto"/>
-                <w:sz w:val="16"/>
-                <w:szCs w:val="16"/>
-              </w:rPr>
-            </w:pPr>
-            <w:r>
-              <w:rPr>
-                <w:color w:val="auto"/>
+                <w:color w:val="000000" w:themeColor="text1"/>
+                <w:sz w:val="16"/>
+                <w:szCs w:val="16"/>
+              </w:rPr>
+            </w:pPr>
+            <w:r>
+              <w:rPr>
+                <w:color w:val="000000" w:themeColor="text1"/>
                 <w:sz w:val="16"/>
                 <w:szCs w:val="16"/>
               </w:rPr>
@@ -1185,7 +1203,7 @@
             </w:r>
             <w:r>
               <w:rPr>
-                <w:color w:val="auto"/>
+                <w:color w:val="000000" w:themeColor="text1"/>
                 <w:sz w:val="16"/>
                 <w:szCs w:val="16"/>
               </w:rPr>
@@ -1193,7 +1211,7 @@
             </w:r>
             <w:r>
               <w:rPr>
-                <w:color w:val="auto"/>
+                <w:color w:val="000000" w:themeColor="text1"/>
                 <w:sz w:val="16"/>
                 <w:szCs w:val="16"/>
               </w:rPr>
@@ -1205,14 +1223,14 @@
               <w:spacing w:after="60" w:line="252" w:lineRule="auto"/>
               <w:jc w:val="both"/>
               <w:rPr>
-                <w:color w:val="auto"/>
-                <w:sz w:val="16"/>
-                <w:szCs w:val="16"/>
-              </w:rPr>
-            </w:pPr>
-            <w:r>
-              <w:rPr>
-                <w:color w:val="auto"/>
+                <w:color w:val="000000" w:themeColor="text1"/>
+                <w:sz w:val="16"/>
+                <w:szCs w:val="16"/>
+              </w:rPr>
+            </w:pPr>
+            <w:r>
+              <w:rPr>
+                <w:color w:val="000000" w:themeColor="text1"/>
                 <w:sz w:val="16"/>
                 <w:szCs w:val="16"/>
               </w:rPr>
@@ -1241,7 +1259,7 @@
             <w:pPr>
               <w:spacing w:after="60"/>
               <w:rPr>
-                <w:color w:val="auto"/>
+                <w:color w:val="000000" w:themeColor="text1"/>
                 <w:sz w:val="16"/>
                 <w:szCs w:val="16"/>
               </w:rPr>
@@ -1250,7 +1268,7 @@
               <w:rPr>
                 <w:b/>
                 <w:bCs/>
-                <w:color w:val="auto"/>
+                <w:color w:val="000000" w:themeColor="text1"/>
                 <w:sz w:val="17"/>
                 <w:szCs w:val="17"/>
               </w:rPr>
@@ -1262,14 +1280,14 @@
               <w:spacing w:after="60" w:line="252" w:lineRule="auto"/>
               <w:jc w:val="both"/>
               <w:rPr>
-                <w:color w:val="auto"/>
-                <w:sz w:val="16"/>
-                <w:szCs w:val="16"/>
-              </w:rPr>
-            </w:pPr>
-            <w:r>
-              <w:rPr>
-                <w:color w:val="auto"/>
+                <w:color w:val="000000" w:themeColor="text1"/>
+                <w:sz w:val="16"/>
+                <w:szCs w:val="16"/>
+              </w:rPr>
+            </w:pPr>
+            <w:r>
+              <w:rPr>
+                <w:color w:val="000000" w:themeColor="text1"/>
                 <w:sz w:val="16"/>
                 <w:szCs w:val="16"/>
               </w:rPr>
@@ -1281,14 +1299,14 @@
               <w:spacing w:after="60" w:line="252" w:lineRule="auto"/>
               <w:jc w:val="both"/>
               <w:rPr>
-                <w:color w:val="auto"/>
-                <w:sz w:val="16"/>
-                <w:szCs w:val="16"/>
-              </w:rPr>
-            </w:pPr>
-            <w:r>
-              <w:rPr>
-                <w:color w:val="auto"/>
+                <w:color w:val="000000" w:themeColor="text1"/>
+                <w:sz w:val="16"/>
+                <w:szCs w:val="16"/>
+              </w:rPr>
+            </w:pPr>
+            <w:r>
+              <w:rPr>
+                <w:color w:val="000000" w:themeColor="text1"/>
                 <w:sz w:val="16"/>
                 <w:szCs w:val="16"/>
               </w:rPr>
@@ -1319,7 +1337,7 @@
             <w:pPr>
               <w:spacing w:after="60"/>
               <w:rPr>
-                <w:color w:val="auto"/>
+                <w:color w:val="000000" w:themeColor="text1"/>
                 <w:sz w:val="16"/>
                 <w:szCs w:val="16"/>
               </w:rPr>
@@ -1328,7 +1346,7 @@
               <w:rPr>
                 <w:b/>
                 <w:bCs/>
-                <w:color w:val="auto"/>
+                <w:color w:val="000000" w:themeColor="text1"/>
                 <w:sz w:val="17"/>
                 <w:szCs w:val="17"/>
               </w:rPr>
@@ -1340,14 +1358,14 @@
               <w:spacing w:after="60" w:line="252" w:lineRule="auto"/>
               <w:jc w:val="both"/>
               <w:rPr>
-                <w:color w:val="auto"/>
-                <w:sz w:val="16"/>
-                <w:szCs w:val="16"/>
-              </w:rPr>
-            </w:pPr>
-            <w:r>
-              <w:rPr>
-                <w:color w:val="auto"/>
+                <w:color w:val="000000" w:themeColor="text1"/>
+                <w:sz w:val="16"/>
+                <w:szCs w:val="16"/>
+              </w:rPr>
+            </w:pPr>
+            <w:r>
+              <w:rPr>
+                <w:color w:val="000000" w:themeColor="text1"/>
                 <w:sz w:val="16"/>
                 <w:szCs w:val="16"/>
               </w:rPr>
@@ -1355,7 +1373,7 @@
             </w:r>
             <w:r>
               <w:rPr>
-                <w:color w:val="auto"/>
+                <w:color w:val="000000" w:themeColor="text1"/>
                 <w:sz w:val="16"/>
                 <w:szCs w:val="16"/>
               </w:rPr>
@@ -1368,14 +1386,14 @@
               <w:spacing w:after="60" w:line="252" w:lineRule="auto"/>
               <w:jc w:val="both"/>
               <w:rPr>
-                <w:color w:val="auto"/>
-                <w:sz w:val="16"/>
-                <w:szCs w:val="16"/>
-              </w:rPr>
-            </w:pPr>
-            <w:r>
-              <w:rPr>
-                <w:color w:val="auto"/>
+                <w:color w:val="000000" w:themeColor="text1"/>
+                <w:sz w:val="16"/>
+                <w:szCs w:val="16"/>
+              </w:rPr>
+            </w:pPr>
+            <w:r>
+              <w:rPr>
+                <w:color w:val="000000" w:themeColor="text1"/>
                 <w:sz w:val="16"/>
                 <w:szCs w:val="16"/>
               </w:rPr>
@@ -1404,7 +1422,7 @@
             <w:pPr>
               <w:spacing w:after="60"/>
               <w:rPr>
-                <w:color w:val="auto"/>
+                <w:color w:val="000000" w:themeColor="text1"/>
                 <w:sz w:val="16"/>
                 <w:szCs w:val="16"/>
               </w:rPr>
@@ -1413,7 +1431,7 @@
               <w:rPr>
                 <w:b/>
                 <w:bCs/>
-                <w:color w:val="auto"/>
+                <w:color w:val="000000" w:themeColor="text1"/>
                 <w:sz w:val="17"/>
                 <w:szCs w:val="17"/>
               </w:rPr>
@@ -1426,14 +1444,14 @@
               <w:spacing w:after="60" w:line="252" w:lineRule="auto"/>
               <w:jc w:val="both"/>
               <w:rPr>
-                <w:color w:val="auto"/>
-                <w:sz w:val="16"/>
-                <w:szCs w:val="16"/>
-              </w:rPr>
-            </w:pPr>
-            <w:r>
-              <w:rPr>
-                <w:color w:val="auto"/>
+                <w:color w:val="000000" w:themeColor="text1"/>
+                <w:sz w:val="16"/>
+                <w:szCs w:val="16"/>
+              </w:rPr>
+            </w:pPr>
+            <w:r>
+              <w:rPr>
+                <w:color w:val="000000" w:themeColor="text1"/>
                 <w:sz w:val="16"/>
                 <w:szCs w:val="16"/>
               </w:rPr>
@@ -1445,14 +1463,14 @@
               <w:spacing w:after="60" w:line="252" w:lineRule="auto"/>
               <w:jc w:val="both"/>
               <w:rPr>
-                <w:color w:val="auto"/>
-                <w:sz w:val="16"/>
-                <w:szCs w:val="16"/>
-              </w:rPr>
-            </w:pPr>
-            <w:r>
-              <w:rPr>
-                <w:color w:val="auto"/>
+                <w:color w:val="000000" w:themeColor="text1"/>
+                <w:sz w:val="16"/>
+                <w:szCs w:val="16"/>
+              </w:rPr>
+            </w:pPr>
+            <w:r>
+              <w:rPr>
+                <w:color w:val="000000" w:themeColor="text1"/>
                 <w:sz w:val="16"/>
                 <w:szCs w:val="16"/>
               </w:rPr>
@@ -1484,7 +1502,7 @@
             <w:pPr>
               <w:spacing w:after="60"/>
               <w:rPr>
-                <w:color w:val="auto"/>
+                <w:color w:val="000000" w:themeColor="text1"/>
                 <w:sz w:val="16"/>
                 <w:szCs w:val="16"/>
               </w:rPr>
@@ -1493,7 +1511,7 @@
               <w:rPr>
                 <w:b/>
                 <w:bCs/>
-                <w:color w:val="auto"/>
+                <w:color w:val="000000" w:themeColor="text1"/>
                 <w:sz w:val="17"/>
                 <w:szCs w:val="17"/>
               </w:rPr>
@@ -1506,14 +1524,14 @@
               <w:spacing w:after="60" w:line="252" w:lineRule="auto"/>
               <w:jc w:val="both"/>
               <w:rPr>
-                <w:color w:val="auto"/>
-                <w:sz w:val="16"/>
-                <w:szCs w:val="16"/>
-              </w:rPr>
-            </w:pPr>
-            <w:r>
-              <w:rPr>
-                <w:color w:val="auto"/>
+                <w:color w:val="000000" w:themeColor="text1"/>
+                <w:sz w:val="16"/>
+                <w:szCs w:val="16"/>
+              </w:rPr>
+            </w:pPr>
+            <w:r>
+              <w:rPr>
+                <w:color w:val="000000" w:themeColor="text1"/>
                 <w:sz w:val="16"/>
                 <w:szCs w:val="16"/>
               </w:rPr>
@@ -1542,7 +1560,7 @@
             <w:pPr>
               <w:spacing w:after="60"/>
               <w:rPr>
-                <w:color w:val="auto"/>
+                <w:color w:val="000000" w:themeColor="text1"/>
                 <w:sz w:val="16"/>
                 <w:szCs w:val="16"/>
               </w:rPr>
@@ -1551,7 +1569,7 @@
               <w:rPr>
                 <w:b/>
                 <w:bCs/>
-                <w:color w:val="auto"/>
+                <w:color w:val="000000" w:themeColor="text1"/>
                 <w:sz w:val="17"/>
                 <w:szCs w:val="17"/>
               </w:rPr>
@@ -1563,14 +1581,14 @@
               <w:spacing w:after="60" w:line="252" w:lineRule="auto"/>
               <w:jc w:val="both"/>
               <w:rPr>
-                <w:color w:val="auto"/>
-                <w:sz w:val="16"/>
-                <w:szCs w:val="16"/>
-              </w:rPr>
-            </w:pPr>
-            <w:r>
-              <w:rPr>
-                <w:color w:val="auto"/>
+                <w:color w:val="000000" w:themeColor="text1"/>
+                <w:sz w:val="16"/>
+                <w:szCs w:val="16"/>
+              </w:rPr>
+            </w:pPr>
+            <w:r>
+              <w:rPr>
+                <w:color w:val="000000" w:themeColor="text1"/>
                 <w:sz w:val="16"/>
                 <w:szCs w:val="16"/>
               </w:rPr>
@@ -1601,7 +1619,7 @@
             <w:pPr>
               <w:spacing w:after="60"/>
               <w:rPr>
-                <w:color w:val="auto"/>
+                <w:color w:val="000000" w:themeColor="text1"/>
                 <w:sz w:val="16"/>
                 <w:szCs w:val="16"/>
               </w:rPr>
@@ -1610,7 +1628,7 @@
               <w:rPr>
                 <w:b/>
                 <w:bCs/>
-                <w:color w:val="auto"/>
+                <w:color w:val="000000" w:themeColor="text1"/>
                 <w:sz w:val="17"/>
                 <w:szCs w:val="17"/>
               </w:rPr>
@@ -1626,14 +1644,14 @@
               </w:numPr>
               <w:spacing w:after="40" w:line="252" w:lineRule="auto"/>
               <w:rPr>
-                <w:color w:val="auto"/>
-                <w:sz w:val="16"/>
-                <w:szCs w:val="16"/>
-              </w:rPr>
-            </w:pPr>
-            <w:r>
-              <w:rPr>
-                <w:color w:val="auto"/>
+                <w:color w:val="000000" w:themeColor="text1"/>
+                <w:sz w:val="16"/>
+                <w:szCs w:val="16"/>
+              </w:rPr>
+            </w:pPr>
+            <w:r>
+              <w:rPr>
+                <w:color w:val="000000" w:themeColor="text1"/>
                 <w:sz w:val="16"/>
                 <w:szCs w:val="16"/>
               </w:rPr>
@@ -1641,7 +1659,7 @@
             </w:r>
             <w:r>
               <w:rPr>
-                <w:color w:val="auto"/>
+                <w:color w:val="000000" w:themeColor="text1"/>
                 <w:sz w:val="16"/>
                 <w:szCs w:val="16"/>
               </w:rPr>
@@ -1649,7 +1667,7 @@
             </w:r>
             <w:r>
               <w:rPr>
-                <w:color w:val="auto"/>
+                <w:color w:val="000000" w:themeColor="text1"/>
                 <w:sz w:val="16"/>
                 <w:szCs w:val="16"/>
               </w:rPr>
@@ -1665,14 +1683,14 @@
               </w:numPr>
               <w:spacing w:after="40" w:line="252" w:lineRule="auto"/>
               <w:rPr>
-                <w:color w:val="auto"/>
-                <w:sz w:val="16"/>
-                <w:szCs w:val="16"/>
-              </w:rPr>
-            </w:pPr>
-            <w:r>
-              <w:rPr>
-                <w:color w:val="auto"/>
+                <w:color w:val="000000" w:themeColor="text1"/>
+                <w:sz w:val="16"/>
+                <w:szCs w:val="16"/>
+              </w:rPr>
+            </w:pPr>
+            <w:r>
+              <w:rPr>
+                <w:color w:val="000000" w:themeColor="text1"/>
                 <w:sz w:val="16"/>
                 <w:szCs w:val="16"/>
               </w:rPr>
@@ -1680,7 +1698,7 @@
             </w:r>
             <w:r>
               <w:rPr>
-                <w:color w:val="auto"/>
+                <w:color w:val="000000" w:themeColor="text1"/>
                 <w:sz w:val="16"/>
                 <w:szCs w:val="16"/>
               </w:rPr>
@@ -1688,7 +1706,7 @@
             </w:r>
             <w:r>
               <w:rPr>
-                <w:color w:val="auto"/>
+                <w:color w:val="000000" w:themeColor="text1"/>
                 <w:sz w:val="16"/>
                 <w:szCs w:val="16"/>
               </w:rPr>
@@ -1704,14 +1722,14 @@
               </w:numPr>
               <w:spacing w:after="40" w:line="252" w:lineRule="auto"/>
               <w:rPr>
-                <w:color w:val="auto"/>
-                <w:sz w:val="16"/>
-                <w:szCs w:val="16"/>
-              </w:rPr>
-            </w:pPr>
-            <w:r>
-              <w:rPr>
-                <w:color w:val="auto"/>
+                <w:color w:val="000000" w:themeColor="text1"/>
+                <w:sz w:val="16"/>
+                <w:szCs w:val="16"/>
+              </w:rPr>
+            </w:pPr>
+            <w:r>
+              <w:rPr>
+                <w:color w:val="000000" w:themeColor="text1"/>
                 <w:sz w:val="16"/>
                 <w:szCs w:val="16"/>
               </w:rPr>
@@ -1719,7 +1737,7 @@
             </w:r>
             <w:r>
               <w:rPr>
-                <w:color w:val="auto"/>
+                <w:color w:val="000000" w:themeColor="text1"/>
                 <w:sz w:val="16"/>
                 <w:szCs w:val="16"/>
               </w:rPr>
@@ -1727,7 +1745,7 @@
             </w:r>
             <w:r>
               <w:rPr>
-                <w:color w:val="auto"/>
+                <w:color w:val="000000" w:themeColor="text1"/>
                 <w:sz w:val="16"/>
                 <w:szCs w:val="16"/>
               </w:rPr>
@@ -1743,14 +1761,14 @@
               </w:numPr>
               <w:spacing w:after="40" w:line="252" w:lineRule="auto"/>
               <w:rPr>
-                <w:color w:val="auto"/>
-                <w:sz w:val="16"/>
-                <w:szCs w:val="16"/>
-              </w:rPr>
-            </w:pPr>
-            <w:r>
-              <w:rPr>
-                <w:color w:val="auto"/>
+                <w:color w:val="000000" w:themeColor="text1"/>
+                <w:sz w:val="16"/>
+                <w:szCs w:val="16"/>
+              </w:rPr>
+            </w:pPr>
+            <w:r>
+              <w:rPr>
+                <w:color w:val="000000" w:themeColor="text1"/>
                 <w:sz w:val="16"/>
                 <w:szCs w:val="16"/>
               </w:rPr>
@@ -1758,7 +1776,7 @@
             </w:r>
             <w:r>
               <w:rPr>
-                <w:color w:val="auto"/>
+                <w:color w:val="000000" w:themeColor="text1"/>
                 <w:sz w:val="16"/>
                 <w:szCs w:val="16"/>
               </w:rPr>
@@ -1766,7 +1784,7 @@
             </w:r>
             <w:r>
               <w:rPr>
-                <w:color w:val="auto"/>
+                <w:color w:val="000000" w:themeColor="text1"/>
                 <w:sz w:val="16"/>
                 <w:szCs w:val="16"/>
               </w:rPr>
@@ -1795,7 +1813,7 @@
             <w:pPr>
               <w:spacing w:after="60"/>
               <w:rPr>
-                <w:color w:val="auto"/>
+                <w:color w:val="000000" w:themeColor="text1"/>
                 <w:sz w:val="16"/>
                 <w:szCs w:val="16"/>
               </w:rPr>
@@ -1804,7 +1822,7 @@
               <w:rPr>
                 <w:b/>
                 <w:bCs/>
-                <w:color w:val="auto"/>
+                <w:color w:val="000000" w:themeColor="text1"/>
                 <w:sz w:val="17"/>
                 <w:szCs w:val="17"/>
               </w:rPr>
@@ -1820,14 +1838,14 @@
               </w:numPr>
               <w:spacing w:after="40" w:line="252" w:lineRule="auto"/>
               <w:rPr>
-                <w:color w:val="auto"/>
-                <w:sz w:val="16"/>
-                <w:szCs w:val="16"/>
-              </w:rPr>
-            </w:pPr>
-            <w:r>
-              <w:rPr>
-                <w:color w:val="auto"/>
+                <w:color w:val="000000" w:themeColor="text1"/>
+                <w:sz w:val="16"/>
+                <w:szCs w:val="16"/>
+              </w:rPr>
+            </w:pPr>
+            <w:r>
+              <w:rPr>
+                <w:color w:val="000000" w:themeColor="text1"/>
                 <w:sz w:val="16"/>
                 <w:szCs w:val="16"/>
               </w:rPr>
@@ -1835,7 +1853,7 @@
             </w:r>
             <w:r>
               <w:rPr>
-                <w:color w:val="auto"/>
+                <w:color w:val="000000" w:themeColor="text1"/>
                 <w:sz w:val="16"/>
                 <w:szCs w:val="16"/>
               </w:rPr>
@@ -1843,7 +1861,7 @@
             </w:r>
             <w:r>
               <w:rPr>
-                <w:color w:val="auto"/>
+                <w:color w:val="000000" w:themeColor="text1"/>
                 <w:sz w:val="16"/>
                 <w:szCs w:val="16"/>
               </w:rPr>
@@ -1859,14 +1877,14 @@
               </w:numPr>
               <w:spacing w:after="40" w:line="252" w:lineRule="auto"/>
               <w:rPr>
-                <w:color w:val="auto"/>
-                <w:sz w:val="16"/>
-                <w:szCs w:val="16"/>
-              </w:rPr>
-            </w:pPr>
-            <w:r>
-              <w:rPr>
-                <w:color w:val="auto"/>
+                <w:color w:val="000000" w:themeColor="text1"/>
+                <w:sz w:val="16"/>
+                <w:szCs w:val="16"/>
+              </w:rPr>
+            </w:pPr>
+            <w:r>
+              <w:rPr>
+                <w:color w:val="000000" w:themeColor="text1"/>
                 <w:sz w:val="16"/>
                 <w:szCs w:val="16"/>
               </w:rPr>
@@ -1874,7 +1892,7 @@
             </w:r>
             <w:r>
               <w:rPr>
-                <w:color w:val="auto"/>
+                <w:color w:val="000000" w:themeColor="text1"/>
                 <w:sz w:val="16"/>
                 <w:szCs w:val="16"/>
               </w:rPr>
@@ -1882,7 +1900,7 @@
             </w:r>
             <w:r>
               <w:rPr>
-                <w:color w:val="auto"/>
+                <w:color w:val="000000" w:themeColor="text1"/>
                 <w:sz w:val="16"/>
                 <w:szCs w:val="16"/>
               </w:rPr>
@@ -1898,14 +1916,14 @@
               </w:numPr>
               <w:spacing w:after="40" w:line="252" w:lineRule="auto"/>
               <w:rPr>
-                <w:color w:val="auto"/>
-                <w:sz w:val="16"/>
-                <w:szCs w:val="16"/>
-              </w:rPr>
-            </w:pPr>
-            <w:r>
-              <w:rPr>
-                <w:color w:val="auto"/>
+                <w:color w:val="000000" w:themeColor="text1"/>
+                <w:sz w:val="16"/>
+                <w:szCs w:val="16"/>
+              </w:rPr>
+            </w:pPr>
+            <w:r>
+              <w:rPr>
+                <w:color w:val="000000" w:themeColor="text1"/>
                 <w:sz w:val="16"/>
                 <w:szCs w:val="16"/>
               </w:rPr>
@@ -1913,7 +1931,7 @@
             </w:r>
             <w:r>
               <w:rPr>
-                <w:color w:val="auto"/>
+                <w:color w:val="000000" w:themeColor="text1"/>
                 <w:sz w:val="16"/>
                 <w:szCs w:val="16"/>
               </w:rPr>
@@ -1921,7 +1939,7 @@
             </w:r>
             <w:r>
               <w:rPr>
-                <w:color w:val="auto"/>
+                <w:color w:val="000000" w:themeColor="text1"/>
                 <w:sz w:val="16"/>
                 <w:szCs w:val="16"/>
               </w:rPr>
@@ -1937,14 +1955,14 @@
               </w:numPr>
               <w:spacing w:after="40" w:line="252" w:lineRule="auto"/>
               <w:rPr>
-                <w:color w:val="auto"/>
-                <w:sz w:val="16"/>
-                <w:szCs w:val="16"/>
-              </w:rPr>
-            </w:pPr>
-            <w:r>
-              <w:rPr>
-                <w:color w:val="auto"/>
+                <w:color w:val="000000" w:themeColor="text1"/>
+                <w:sz w:val="16"/>
+                <w:szCs w:val="16"/>
+              </w:rPr>
+            </w:pPr>
+            <w:r>
+              <w:rPr>
+                <w:color w:val="000000" w:themeColor="text1"/>
                 <w:sz w:val="16"/>
                 <w:szCs w:val="16"/>
               </w:rPr>
@@ -1952,7 +1970,7 @@
             </w:r>
             <w:r>
               <w:rPr>
-                <w:color w:val="auto"/>
+                <w:color w:val="000000" w:themeColor="text1"/>
                 <w:sz w:val="16"/>
                 <w:szCs w:val="16"/>
               </w:rPr>
@@ -1960,7 +1978,7 @@
             </w:r>
             <w:r>
               <w:rPr>
-                <w:color w:val="auto"/>
+                <w:color w:val="000000" w:themeColor="text1"/>
                 <w:sz w:val="16"/>
                 <w:szCs w:val="16"/>
               </w:rPr>
@@ -1991,7 +2009,7 @@
             <w:pPr>
               <w:spacing w:after="60"/>
               <w:rPr>
-                <w:color w:val="auto"/>
+                <w:color w:val="000000" w:themeColor="text1"/>
                 <w:sz w:val="16"/>
                 <w:szCs w:val="16"/>
               </w:rPr>
@@ -2000,7 +2018,7 @@
               <w:rPr>
                 <w:b/>
                 <w:bCs/>
-                <w:color w:val="auto"/>
+                <w:color w:val="000000" w:themeColor="text1"/>
                 <w:sz w:val="17"/>
                 <w:szCs w:val="17"/>
               </w:rPr>
@@ -2012,14 +2030,14 @@
               <w:spacing w:after="60" w:line="252" w:lineRule="auto"/>
               <w:jc w:val="both"/>
               <w:rPr>
-                <w:color w:val="auto"/>
-                <w:sz w:val="16"/>
-                <w:szCs w:val="16"/>
-              </w:rPr>
-            </w:pPr>
-            <w:r>
-              <w:rPr>
-                <w:color w:val="auto"/>
+                <w:color w:val="000000" w:themeColor="text1"/>
+                <w:sz w:val="16"/>
+                <w:szCs w:val="16"/>
+              </w:rPr>
+            </w:pPr>
+            <w:r>
+              <w:rPr>
+                <w:color w:val="000000" w:themeColor="text1"/>
                 <w:sz w:val="16"/>
                 <w:szCs w:val="16"/>
               </w:rPr>
@@ -2031,14 +2049,14 @@
               <w:spacing w:after="60" w:line="252" w:lineRule="auto"/>
               <w:jc w:val="both"/>
               <w:rPr>
-                <w:color w:val="auto"/>
-                <w:sz w:val="16"/>
-                <w:szCs w:val="16"/>
-              </w:rPr>
-            </w:pPr>
-            <w:r>
-              <w:rPr>
-                <w:color w:val="auto"/>
+                <w:color w:val="000000" w:themeColor="text1"/>
+                <w:sz w:val="16"/>
+                <w:szCs w:val="16"/>
+              </w:rPr>
+            </w:pPr>
+            <w:r>
+              <w:rPr>
+                <w:color w:val="000000" w:themeColor="text1"/>
                 <w:sz w:val="16"/>
                 <w:szCs w:val="16"/>
               </w:rPr>
@@ -2050,14 +2068,14 @@
               <w:spacing w:after="60" w:line="252" w:lineRule="auto"/>
               <w:jc w:val="both"/>
               <w:rPr>
-                <w:color w:val="auto"/>
-                <w:sz w:val="16"/>
-                <w:szCs w:val="16"/>
-              </w:rPr>
-            </w:pPr>
-            <w:r>
-              <w:rPr>
-                <w:color w:val="auto"/>
+                <w:color w:val="000000" w:themeColor="text1"/>
+                <w:sz w:val="16"/>
+                <w:szCs w:val="16"/>
+              </w:rPr>
+            </w:pPr>
+            <w:r>
+              <w:rPr>
+                <w:color w:val="000000" w:themeColor="text1"/>
                 <w:sz w:val="16"/>
                 <w:szCs w:val="16"/>
               </w:rPr>
@@ -2086,7 +2104,7 @@
             <w:pPr>
               <w:spacing w:after="60"/>
               <w:rPr>
-                <w:color w:val="auto"/>
+                <w:color w:val="000000" w:themeColor="text1"/>
                 <w:sz w:val="16"/>
                 <w:szCs w:val="16"/>
               </w:rPr>
@@ -2095,7 +2113,7 @@
               <w:rPr>
                 <w:b/>
                 <w:bCs/>
-                <w:color w:val="auto"/>
+                <w:color w:val="000000" w:themeColor="text1"/>
                 <w:sz w:val="17"/>
                 <w:szCs w:val="17"/>
               </w:rPr>
@@ -2107,14 +2125,14 @@
               <w:spacing w:after="60" w:line="252" w:lineRule="auto"/>
               <w:jc w:val="both"/>
               <w:rPr>
-                <w:color w:val="auto"/>
-                <w:sz w:val="16"/>
-                <w:szCs w:val="16"/>
-              </w:rPr>
-            </w:pPr>
-            <w:r>
-              <w:rPr>
-                <w:color w:val="auto"/>
+                <w:color w:val="000000" w:themeColor="text1"/>
+                <w:sz w:val="16"/>
+                <w:szCs w:val="16"/>
+              </w:rPr>
+            </w:pPr>
+            <w:r>
+              <w:rPr>
+                <w:color w:val="000000" w:themeColor="text1"/>
                 <w:sz w:val="16"/>
                 <w:szCs w:val="16"/>
               </w:rPr>
@@ -2126,14 +2144,14 @@
               <w:spacing w:after="60" w:line="252" w:lineRule="auto"/>
               <w:jc w:val="both"/>
               <w:rPr>
-                <w:color w:val="auto"/>
-                <w:sz w:val="16"/>
-                <w:szCs w:val="16"/>
-              </w:rPr>
-            </w:pPr>
-            <w:r>
-              <w:rPr>
-                <w:color w:val="auto"/>
+                <w:color w:val="000000" w:themeColor="text1"/>
+                <w:sz w:val="16"/>
+                <w:szCs w:val="16"/>
+              </w:rPr>
+            </w:pPr>
+            <w:r>
+              <w:rPr>
+                <w:color w:val="000000" w:themeColor="text1"/>
                 <w:sz w:val="16"/>
                 <w:szCs w:val="16"/>
               </w:rPr>
@@ -2145,14 +2163,14 @@
               <w:spacing w:after="60" w:line="252" w:lineRule="auto"/>
               <w:jc w:val="both"/>
               <w:rPr>
-                <w:color w:val="auto"/>
-                <w:sz w:val="16"/>
-                <w:szCs w:val="16"/>
-              </w:rPr>
-            </w:pPr>
-            <w:r>
-              <w:rPr>
-                <w:color w:val="auto"/>
+                <w:color w:val="000000" w:themeColor="text1"/>
+                <w:sz w:val="16"/>
+                <w:szCs w:val="16"/>
+              </w:rPr>
+            </w:pPr>
+            <w:r>
+              <w:rPr>
+                <w:color w:val="000000" w:themeColor="text1"/>
                 <w:sz w:val="16"/>
                 <w:szCs w:val="16"/>
               </w:rPr>
@@ -2183,7 +2201,7 @@
             <w:pPr>
               <w:spacing w:after="60"/>
               <w:rPr>
-                <w:color w:val="auto"/>
+                <w:color w:val="000000" w:themeColor="text1"/>
                 <w:sz w:val="16"/>
                 <w:szCs w:val="16"/>
               </w:rPr>
@@ -2192,7 +2210,7 @@
               <w:rPr>
                 <w:b/>
                 <w:bCs/>
-                <w:color w:val="auto"/>
+                <w:color w:val="000000" w:themeColor="text1"/>
                 <w:sz w:val="17"/>
                 <w:szCs w:val="17"/>
               </w:rPr>
@@ -2204,14 +2222,14 @@
               <w:spacing w:after="60" w:line="252" w:lineRule="auto"/>
               <w:jc w:val="both"/>
               <w:rPr>
-                <w:color w:val="auto"/>
-                <w:sz w:val="16"/>
-                <w:szCs w:val="16"/>
-              </w:rPr>
-            </w:pPr>
-            <w:r>
-              <w:rPr>
-                <w:color w:val="auto"/>
+                <w:color w:val="000000" w:themeColor="text1"/>
+                <w:sz w:val="16"/>
+                <w:szCs w:val="16"/>
+              </w:rPr>
+            </w:pPr>
+            <w:r>
+              <w:rPr>
+                <w:color w:val="000000" w:themeColor="text1"/>
                 <w:sz w:val="16"/>
                 <w:szCs w:val="16"/>
               </w:rPr>
@@ -2240,7 +2258,7 @@
             <w:pPr>
               <w:spacing w:after="60"/>
               <w:rPr>
-                <w:color w:val="auto"/>
+                <w:color w:val="000000" w:themeColor="text1"/>
                 <w:sz w:val="16"/>
                 <w:szCs w:val="16"/>
               </w:rPr>
@@ -2249,7 +2267,7 @@
               <w:rPr>
                 <w:b/>
                 <w:bCs/>
-                <w:color w:val="auto"/>
+                <w:color w:val="000000" w:themeColor="text1"/>
                 <w:sz w:val="17"/>
                 <w:szCs w:val="17"/>
               </w:rPr>
@@ -2261,14 +2279,14 @@
               <w:spacing w:after="60" w:line="252" w:lineRule="auto"/>
               <w:jc w:val="both"/>
               <w:rPr>
-                <w:color w:val="auto"/>
-                <w:sz w:val="16"/>
-                <w:szCs w:val="16"/>
-              </w:rPr>
-            </w:pPr>
-            <w:r>
-              <w:rPr>
-                <w:color w:val="auto"/>
+                <w:color w:val="000000" w:themeColor="text1"/>
+                <w:sz w:val="16"/>
+                <w:szCs w:val="16"/>
+              </w:rPr>
+            </w:pPr>
+            <w:r>
+              <w:rPr>
+                <w:color w:val="000000" w:themeColor="text1"/>
                 <w:sz w:val="16"/>
                 <w:szCs w:val="16"/>
               </w:rPr>
@@ -2299,7 +2317,7 @@
             <w:pPr>
               <w:spacing w:after="60"/>
               <w:rPr>
-                <w:color w:val="auto"/>
+                <w:color w:val="000000" w:themeColor="text1"/>
                 <w:sz w:val="16"/>
                 <w:szCs w:val="16"/>
               </w:rPr>
@@ -2308,7 +2326,7 @@
               <w:rPr>
                 <w:b/>
                 <w:bCs/>
-                <w:color w:val="auto"/>
+                <w:color w:val="000000" w:themeColor="text1"/>
                 <w:sz w:val="17"/>
                 <w:szCs w:val="17"/>
               </w:rPr>
@@ -2320,14 +2338,14 @@
               <w:spacing w:after="60" w:line="252" w:lineRule="auto"/>
               <w:jc w:val="both"/>
               <w:rPr>
-                <w:color w:val="auto"/>
-                <w:sz w:val="16"/>
-                <w:szCs w:val="16"/>
-              </w:rPr>
-            </w:pPr>
-            <w:r>
-              <w:rPr>
-                <w:color w:val="auto"/>
+                <w:color w:val="000000" w:themeColor="text1"/>
+                <w:sz w:val="16"/>
+                <w:szCs w:val="16"/>
+              </w:rPr>
+            </w:pPr>
+            <w:r>
+              <w:rPr>
+                <w:color w:val="000000" w:themeColor="text1"/>
                 <w:sz w:val="16"/>
                 <w:szCs w:val="16"/>
               </w:rPr>
@@ -2356,7 +2374,7 @@
             <w:pPr>
               <w:spacing w:after="60"/>
               <w:rPr>
-                <w:color w:val="auto"/>
+                <w:color w:val="000000" w:themeColor="text1"/>
                 <w:sz w:val="16"/>
                 <w:szCs w:val="16"/>
               </w:rPr>
@@ -2365,7 +2383,7 @@
               <w:rPr>
                 <w:b/>
                 <w:bCs/>
-                <w:color w:val="auto"/>
+                <w:color w:val="000000" w:themeColor="text1"/>
                 <w:sz w:val="17"/>
                 <w:szCs w:val="17"/>
               </w:rPr>
@@ -2377,14 +2395,14 @@
               <w:spacing w:after="60" w:line="252" w:lineRule="auto"/>
               <w:jc w:val="both"/>
               <w:rPr>
-                <w:color w:val="auto"/>
-                <w:sz w:val="16"/>
-                <w:szCs w:val="16"/>
-              </w:rPr>
-            </w:pPr>
-            <w:r>
-              <w:rPr>
-                <w:color w:val="auto"/>
+                <w:color w:val="000000" w:themeColor="text1"/>
+                <w:sz w:val="16"/>
+                <w:szCs w:val="16"/>
+              </w:rPr>
+            </w:pPr>
+            <w:r>
+              <w:rPr>
+                <w:color w:val="000000" w:themeColor="text1"/>
                 <w:sz w:val="16"/>
                 <w:szCs w:val="16"/>
               </w:rPr>
@@ -2415,7 +2433,7 @@
             <w:pPr>
               <w:spacing w:after="60"/>
               <w:rPr>
-                <w:color w:val="auto"/>
+                <w:color w:val="000000" w:themeColor="text1"/>
                 <w:sz w:val="16"/>
                 <w:szCs w:val="16"/>
               </w:rPr>
@@ -2424,7 +2442,7 @@
               <w:rPr>
                 <w:b/>
                 <w:bCs/>
-                <w:color w:val="auto"/>
+                <w:color w:val="000000" w:themeColor="text1"/>
                 <w:sz w:val="17"/>
                 <w:szCs w:val="17"/>
               </w:rPr>
@@ -2436,14 +2454,14 @@
               <w:spacing w:after="60" w:line="252" w:lineRule="auto"/>
               <w:jc w:val="both"/>
               <w:rPr>
-                <w:color w:val="auto"/>
-                <w:sz w:val="16"/>
-                <w:szCs w:val="16"/>
-              </w:rPr>
-            </w:pPr>
-            <w:r>
-              <w:rPr>
-                <w:color w:val="auto"/>
+                <w:color w:val="000000" w:themeColor="text1"/>
+                <w:sz w:val="16"/>
+                <w:szCs w:val="16"/>
+              </w:rPr>
+            </w:pPr>
+            <w:r>
+              <w:rPr>
+                <w:color w:val="000000" w:themeColor="text1"/>
                 <w:sz w:val="16"/>
                 <w:szCs w:val="16"/>
               </w:rPr>
@@ -2455,14 +2473,14 @@
               <w:spacing w:after="60" w:line="252" w:lineRule="auto"/>
               <w:jc w:val="both"/>
               <w:rPr>
-                <w:color w:val="auto"/>
-                <w:sz w:val="16"/>
-                <w:szCs w:val="16"/>
-              </w:rPr>
-            </w:pPr>
-            <w:r>
-              <w:rPr>
-                <w:color w:val="auto"/>
+                <w:color w:val="000000" w:themeColor="text1"/>
+                <w:sz w:val="16"/>
+                <w:szCs w:val="16"/>
+              </w:rPr>
+            </w:pPr>
+            <w:r>
+              <w:rPr>
+                <w:color w:val="000000" w:themeColor="text1"/>
                 <w:sz w:val="16"/>
                 <w:szCs w:val="16"/>
               </w:rPr>
@@ -2491,7 +2509,7 @@
             <w:pPr>
               <w:spacing w:after="60"/>
               <w:rPr>
-                <w:color w:val="auto"/>
+                <w:color w:val="000000" w:themeColor="text1"/>
                 <w:sz w:val="16"/>
                 <w:szCs w:val="16"/>
               </w:rPr>
@@ -2500,7 +2518,7 @@
               <w:rPr>
                 <w:b/>
                 <w:bCs/>
-                <w:color w:val="auto"/>
+                <w:color w:val="000000" w:themeColor="text1"/>
                 <w:sz w:val="17"/>
                 <w:szCs w:val="17"/>
               </w:rPr>
@@ -2512,14 +2530,14 @@
               <w:spacing w:after="60" w:line="252" w:lineRule="auto"/>
               <w:jc w:val="both"/>
               <w:rPr>
-                <w:color w:val="auto"/>
-                <w:sz w:val="16"/>
-                <w:szCs w:val="16"/>
-              </w:rPr>
-            </w:pPr>
-            <w:r>
-              <w:rPr>
-                <w:color w:val="auto"/>
+                <w:color w:val="000000" w:themeColor="text1"/>
+                <w:sz w:val="16"/>
+                <w:szCs w:val="16"/>
+              </w:rPr>
+            </w:pPr>
+            <w:r>
+              <w:rPr>
+                <w:color w:val="000000" w:themeColor="text1"/>
                 <w:sz w:val="16"/>
                 <w:szCs w:val="16"/>
               </w:rPr>
@@ -2531,14 +2549,14 @@
               <w:spacing w:after="60" w:line="252" w:lineRule="auto"/>
               <w:jc w:val="both"/>
               <w:rPr>
-                <w:color w:val="auto"/>
-                <w:sz w:val="16"/>
-                <w:szCs w:val="16"/>
-              </w:rPr>
-            </w:pPr>
-            <w:r>
-              <w:rPr>
-                <w:color w:val="auto"/>
+                <w:color w:val="000000" w:themeColor="text1"/>
+                <w:sz w:val="16"/>
+                <w:szCs w:val="16"/>
+              </w:rPr>
+            </w:pPr>
+            <w:r>
+              <w:rPr>
+                <w:color w:val="000000" w:themeColor="text1"/>
                 <w:sz w:val="16"/>
                 <w:szCs w:val="16"/>
               </w:rPr>
@@ -2676,7 +2694,43 @@
           <w:sz w:val="16"/>
           <w:szCs w:val="16"/>
         </w:rPr>
-        <w:t>Data / Date:  ……………………          Podpis Rodzica / Parent’s signature:  ………………………………………</w:t>
+        <w:t xml:space="preserve">Data / </w:t>
+      </w:r>
+      <w:proofErr w:type="gramStart"/>
+      <w:r>
+        <w:rPr>
+          <w:color w:val="auto"/>
+          <w:sz w:val="16"/>
+          <w:szCs w:val="16"/>
+        </w:rPr>
+        <w:t>Date:  …</w:t>
+      </w:r>
+      <w:proofErr w:type="gramEnd"/>
+      <w:r>
+        <w:rPr>
+          <w:color w:val="auto"/>
+          <w:sz w:val="16"/>
+          <w:szCs w:val="16"/>
+        </w:rPr>
+        <w:t xml:space="preserve">…………………          Podpis Rodzica / Parent’s </w:t>
+      </w:r>
+      <w:proofErr w:type="gramStart"/>
+      <w:r>
+        <w:rPr>
+          <w:color w:val="auto"/>
+          <w:sz w:val="16"/>
+          <w:szCs w:val="16"/>
+        </w:rPr>
+        <w:t>signature:  …</w:t>
+      </w:r>
+      <w:proofErr w:type="gramEnd"/>
+      <w:r>
+        <w:rPr>
+          <w:color w:val="auto"/>
+          <w:sz w:val="16"/>
+          <w:szCs w:val="16"/>
+        </w:rPr>
+        <w:t>……………………………………</w:t>
       </w:r>
     </w:p>
     <w:sectPr>
@@ -3923,15 +3977,6 @@
 </file>
 
 <file path=customXml/item1.xml><?xml version="1.0" encoding="utf-8"?>
-<?mso-contentType ?>
-<FormTemplates xmlns="http://schemas.microsoft.com/sharepoint/v3/contenttype/forms">
-  <Display>DocumentLibraryForm</Display>
-  <Edit>DocumentLibraryForm</Edit>
-  <New>DocumentLibraryForm</New>
-</FormTemplates>
-</file>
-
-<file path=customXml/item2.xml><?xml version="1.0" encoding="utf-8"?>
 <p:properties xmlns:p="http://schemas.microsoft.com/office/2006/metadata/properties" xmlns:xsi="http://www.w3.org/2001/XMLSchema-instance" xmlns:pc="http://schemas.microsoft.com/office/infopath/2007/PartnerControls">
   <documentManagement>
     <lcf76f155ced4ddcb4097134ff3c332f xmlns="2e027105-8ea2-42c2-a209-a1e094f3e975">
@@ -3940,6 +3985,15 @@
     <TaxCatchAll xmlns="8b685c02-ccc9-4c9d-a031-20a05330883a" xsi:nil="true"/>
   </documentManagement>
 </p:properties>
+</file>
+
+<file path=customXml/item2.xml><?xml version="1.0" encoding="utf-8"?>
+<?mso-contentType ?>
+<FormTemplates xmlns="http://schemas.microsoft.com/sharepoint/v3/contenttype/forms">
+  <Display>DocumentLibraryForm</Display>
+  <Edit>DocumentLibraryForm</Edit>
+  <New>DocumentLibraryForm</New>
+</FormTemplates>
 </file>
 
 <file path=customXml/item3.xml><?xml version="1.0" encoding="utf-8"?>
@@ -4198,20 +4252,20 @@
 </file>
 
 <file path=customXml/itemProps1.xml><?xml version="1.0" encoding="utf-8"?>
-<ds:datastoreItem xmlns:ds="http://schemas.openxmlformats.org/officeDocument/2006/customXml" ds:itemID="{643BB2E2-4D57-4B88-8FE1-3BE57E47876E}">
-  <ds:schemaRefs>
-    <ds:schemaRef ds:uri="http://schemas.microsoft.com/sharepoint/v3/contenttype/forms"/>
-  </ds:schemaRefs>
-</ds:datastoreItem>
-</file>
-
-<file path=customXml/itemProps2.xml><?xml version="1.0" encoding="utf-8"?>
 <ds:datastoreItem xmlns:ds="http://schemas.openxmlformats.org/officeDocument/2006/customXml" ds:itemID="{A69558DC-9AEB-45E1-824E-0D833CF17339}">
   <ds:schemaRefs>
     <ds:schemaRef ds:uri="http://schemas.microsoft.com/office/2006/metadata/properties"/>
     <ds:schemaRef ds:uri="http://schemas.microsoft.com/office/infopath/2007/PartnerControls"/>
     <ds:schemaRef ds:uri="2e027105-8ea2-42c2-a209-a1e094f3e975"/>
     <ds:schemaRef ds:uri="8b685c02-ccc9-4c9d-a031-20a05330883a"/>
+  </ds:schemaRefs>
+</ds:datastoreItem>
+</file>
+
+<file path=customXml/itemProps2.xml><?xml version="1.0" encoding="utf-8"?>
+<ds:datastoreItem xmlns:ds="http://schemas.openxmlformats.org/officeDocument/2006/customXml" ds:itemID="{643BB2E2-4D57-4B88-8FE1-3BE57E47876E}">
+  <ds:schemaRefs>
+    <ds:schemaRef ds:uri="http://schemas.microsoft.com/sharepoint/v3/contenttype/forms"/>
   </ds:schemaRefs>
 </ds:datastoreItem>
 </file>

</xml_diff>